<commit_message>
Resume: Compliance Analyst @ Brevan Howard (MNC)
</commit_message>
<xml_diff>
--- a/resumes/Resume_Compliance_Analyst_Brevan_Howard__MNC_.docx
+++ b/resumes/Resume_Compliance_Analyst_Brevan_Howard__MNC_.docx
@@ -412,7 +412,7 @@
           <w:sz w:val="19"/>
           <w:szCs w:val="19"/>
         </w:rPr>
-        <w:t>Triaged 50+ weekly inventory reimbursement cases by severity and policy eligibility, mirroring the structured alert triage and escalation workflow used in Compliance and Risk Management.</w:t>
+        <w:t>Triaged 50+ weekly inventory reimbursement cases by severity and policy eligibility, mirroring the structured alert triage and escalation workflow used in risk management and compliance analyst roles.</w:t>
       </w:r>
       <w:proofErr w:type="spellStart"/>
       <w:r>
@@ -449,7 +449,7 @@
           <w:sz w:val="19"/>
           <w:szCs w:val="19"/>
         </w:rPr>
-        <w:t>Performed root cause analysis on seller claims to identify policy violations and anomalous patterns; escalated findings to senior reviewers, demonstrating investigative instincts central to Compliance and Regulatory Framework.</w:t>
+        <w:t>Performed root cause analysis on seller claims to identify policy violations and anomalous patterns; escalated findings to senior reviewers, demonstrating investigative instincts central to risk management and regulatory compliance analyst operations.</w:t>
       </w:r>
     </w:p>
     <w:p>
@@ -468,7 +468,7 @@
           <w:sz w:val="19"/>
           <w:szCs w:val="19"/>
         </w:rPr>
-        <w:t>Maintained audit-ready case documentation recording investigation findings, decisions, and corrective actions, establishing the evidence chain-of-custody discipline required for Compliance Monitoring and Internal Controls.</w:t>
+        <w:t>Maintained audit-ready case documentation recording investigation findings, decisions, and corrective actions, establishing the evidence chain-of-custody discipline required for security incident reporting and IT audit management.</w:t>
       </w:r>
     </w:p>
     <w:p>
@@ -600,7 +600,7 @@
           <w:sz w:val="19"/>
           <w:szCs w:val="19"/>
         </w:rPr>
-        <w:t>Deployed Telegram bot interface enabling analysts to submit URLs for live ioc enrichment (threat intelligence); supports bulk CSV input/output for incident response workflows and includes osint enrichment (open-source intelligence) via theHarvester for domain profiling.</w:t>
+        <w:t>Deployed Telegram bot interface enabling analysts to submit URLs for live IOC enrichment (threat intelligence); supports bulk CSV input/output for incident response workflows and includes OSINT enrichment (open-source intelligence) via theHarvester for domain profiling.</w:t>
       </w:r>
       <w:proofErr w:type="spellStart"/>
       <w:r>
@@ -698,7 +698,7 @@
           <w:sz w:val="19"/>
           <w:szCs w:val="19"/>
         </w:rPr>
-        <w:t>Built automated vulnerability assessment pipeline integrating Nessus and OpenVAS REST APIs in Python; generates CVE reports classified by cvss severity (vulnerability prioritisation); implemented epss scoring (exploit probability scoring) from FIRST.org API to prioritise by actual exploit probability — a metric rarely used by freshers.</w:t>
+        <w:t>Built automated vulnerability assessment pipeline integrating Nessus and OpenVAS REST APIs in Python; generates CVE reports classified by CVSS severity (vulnerability prioritisation); implemented EPSS scoring (exploit probability scoring) from FIRST.org API to prioritise by actual exploit probability — a metric rarely used by freshers.</w:t>
       </w:r>
     </w:p>
     <w:p>
@@ -717,7 +717,7 @@
           <w:sz w:val="19"/>
           <w:szCs w:val="19"/>
         </w:rPr>
-        <w:t>Developed owasp top 10 (web application security) automated web checker that sends crafted HTTP requests to detect injection, broken auth, and SSRF vulnerabilities; documented SQL injection exploit and parameterised query remediation.</w:t>
+        <w:t>Developed OWASP Top 10 (web application security) automated web checker that sends crafted HTTP requests to detect injection, broken auth, and SSRF vulnerabilities; documented SQL injection exploit and parameterised query remediation.</w:t>
       </w:r>
     </w:p>
     <w:p>
@@ -881,7 +881,7 @@
           <w:sz w:val="19"/>
           <w:szCs w:val="19"/>
         </w:rPr>
-        <w:t>MITRE ATT&amp;CK, OWASP Top 10, Incident Response (PICERL), audit trail documentation</w:t>
+        <w:t>MITRE ATT&amp;CK, OWASP Top 10, Incident Response (PICERL), audit trail documentation, management, management, analysis</w:t>
       </w:r>
     </w:p>
     <w:p>

</xml_diff>